<commit_message>
docs: revisão dos documentos 1, 2 e 4 e correções na ata de abertura
</commit_message>
<xml_diff>
--- a/assets/atas/ATA-2026-08-23-kickoff.docx
+++ b/assets/atas/ATA-2026-08-23-kickoff.docx
@@ -2,34 +2,6 @@
 <file path=word/document.xml><?xml version="1.0" encoding="utf-8"?>
 <w:document xmlns:wpc="http://schemas.microsoft.com/office/word/2010/wordprocessingCanvas" xmlns:cx="http://schemas.microsoft.com/office/drawing/2014/chartex" xmlns:cx1="http://schemas.microsoft.com/office/drawing/2015/9/8/chartex" xmlns:cx2="http://schemas.microsoft.com/office/drawing/2015/10/21/chartex" xmlns:cx3="http://schemas.microsoft.com/office/drawing/2016/5/9/chartex" xmlns:cx4="http://schemas.microsoft.com/office/drawing/2016/5/10/chartex" xmlns:cx5="http://schemas.microsoft.com/office/drawing/2016/5/11/chartex" xmlns:cx6="http://schemas.microsoft.com/office/drawing/2016/5/12/chartex" xmlns:cx7="http://schemas.microsoft.com/office/drawing/2016/5/13/chartex" xmlns:cx8="http://schemas.microsoft.com/office/drawing/2016/5/14/chartex" xmlns:mc="http://schemas.openxmlformats.org/markup-compatibility/2006" xmlns:aink="http://schemas.microsoft.com/office/drawing/2016/ink" xmlns:am3d="http://schemas.microsoft.com/office/drawing/2017/model3d" xmlns:o="urn:schemas-microsoft-com:office:office" xmlns:r="http://schemas.openxmlformats.org/officeDocument/2006/relationships" xmlns:m="http://schemas.openxmlformats.org/officeDocument/2006/math" xmlns:v="urn:schemas-microsoft-com:vml" xmlns:wp14="http://schemas.microsoft.com/office/word/2010/wordprocessingDrawing" xmlns:wp="http://schemas.openxmlformats.org/drawingml/2006/wordprocessingDrawing" xmlns:w10="urn:schemas-microsoft-com:office:word" xmlns:w="http://schemas.openxmlformats.org/wordprocessingml/2006/main" xmlns:w14="http://schemas.microsoft.com/office/word/2010/wordml" xmlns:w15="http://schemas.microsoft.com/office/word/2012/wordml" xmlns:w16cex="http://schemas.microsoft.com/office/word/2018/wordml/cex" xmlns:w16cid="http://schemas.microsoft.com/office/word/2016/wordml/cid" xmlns:w16="http://schemas.microsoft.com/office/word/2018/wordml" xmlns:w16sdtdh="http://schemas.microsoft.com/office/word/2020/wordml/sdtdatahash" xmlns:w16se="http://schemas.microsoft.com/office/word/2015/wordml/symex" xmlns:wpg="http://schemas.microsoft.com/office/word/2010/wordprocessingGroup" xmlns:wpi="http://schemas.microsoft.com/office/word/2010/wordprocessingInk" xmlns:wne="http://schemas.microsoft.com/office/word/2006/wordml" xmlns:wps="http://schemas.microsoft.com/office/word/2010/wordprocessingShape" mc:Ignorable="w14 w15 w16se w16cid w16 w16cex w16sdtdh wp14">
   <w:body>
-    <w:p>
-      <w:pPr>
-        <w:keepNext/>
-        <w:keepLines/>
-        <w:spacing w:after="0" w:line="240" w:lineRule="auto"/>
-        <w:jc w:val="center"/>
-        <w:outlineLvl w:val="0"/>
-        <w:rPr>
-          <w:rFonts w:ascii="Calibri Light" w:eastAsia="MS Gothic" w:hAnsi="Calibri Light" w:cs="Times New Roman"/>
-          <w:b/>
-          <w:bCs/>
-          <w:sz w:val="28"/>
-          <w:szCs w:val="28"/>
-          <w:lang w:eastAsia="en-US"/>
-        </w:rPr>
-      </w:pPr>
-      <w:r>
-        <w:rPr>
-          <w:rFonts w:ascii="Calibri Light" w:eastAsia="MS Gothic" w:hAnsi="Calibri Light" w:cs="Times New Roman"/>
-          <w:b/>
-          <w:bCs/>
-          <w:sz w:val="28"/>
-          <w:szCs w:val="28"/>
-          <w:lang w:eastAsia="en-US"/>
-        </w:rPr>
-        <w:t>Gerência de Projetos de Software</w:t>
-      </w:r>
-    </w:p>
     <w:p>
       <w:pPr>
         <w:keepNext/>
@@ -306,7 +278,7 @@
                 <w:szCs w:val="28"/>
                 <w:lang w:eastAsia="en-US"/>
               </w:rPr>
-              <w:t>Gerente do projeto</w:t>
+              <w:t>Desenvolvedor full-stack — gerente do projeto</w:t>
             </w:r>
           </w:p>
         </w:tc>
@@ -373,7 +345,7 @@
                 <w:szCs w:val="28"/>
                 <w:lang w:eastAsia="en-US"/>
               </w:rPr>
-              <w:t>Desenvolvedor — aplicativo móvel (Flutter)</w:t>
+              <w:t>Desenvolvedor full-stack — frente de aplicativo móvel (Flutter)</w:t>
             </w:r>
           </w:p>
         </w:tc>
@@ -440,7 +412,7 @@
                 <w:szCs w:val="28"/>
                 <w:lang w:eastAsia="en-US"/>
               </w:rPr>
-              <w:t>Desenvolvedor — microsserviços e mensageria</w:t>
+              <w:t>Desenvolvedor full-stack — frente de microsserviços e mensageria</w:t>
             </w:r>
           </w:p>
         </w:tc>
@@ -507,7 +479,7 @@
                 <w:szCs w:val="28"/>
                 <w:lang w:eastAsia="en-US"/>
               </w:rPr>
-              <w:t>Desenvolvedora — aplicação web (Vue)</w:t>
+              <w:t>Desenvolvedora full-stack — frente de aplicação web (Vue)</w:t>
             </w:r>
           </w:p>
         </w:tc>
@@ -580,7 +552,7 @@
                 <w:szCs w:val="28"/>
                 <w:lang w:eastAsia="en-US"/>
               </w:rPr>
-              <w:t>Desenvolvedor — infraestrutura, CI/CD e banco de dados</w:t>
+              <w:t>Desenvolvedor full-stack — frente de infraestrutura, CI/CD e banco de dados</w:t>
             </w:r>
           </w:p>
         </w:tc>
@@ -938,7 +910,7 @@
                 <w:szCs w:val="28"/>
                 <w:lang w:eastAsia="en-US"/>
               </w:rPr>
-              <w:t>5. Papéis definidos — Vicenzo Fonseca: gerente do projeto; Henrique Carvalho: aplicativo móvel (Flutter); Renato Douglas: microsserviços e mensageria; Ana Luiza Rodrigues: aplicação web (Vue); Kayke Emanoel: infraestrutura, CI/CD e banco de dados. Todos atuam como full-stack quando necessário.</w:t>
+              <w:t>5. Papéis definidos — os cinco integrantes atuam como desenvolvedores full-stack; as frentes indicam apenas o foco principal de cada um. Vicenzo Fonseca: gerência do projeto; Henrique Carvalho: aplicativo móvel (Flutter); Renato Douglas: microsserviços e mensageria; Ana Luiza Rodrigues: aplicação web (Vue); Kayke Emanoel: infraestrutura, CI/CD e banco de dados.</w:t>
             </w:r>
           </w:p>
           <w:p>

</xml_diff>

<commit_message>
docs: adiciona ata da reuniao semanal de 11/09 e coluna de assinatura
</commit_message>
<xml_diff>
--- a/assets/atas/ATA-2026-08-23-kickoff.docx
+++ b/assets/atas/ATA-2026-08-23-kickoff.docx
@@ -1,6 +1,6 @@
 
 <file path=word/document.xml><?xml version="1.0" encoding="utf-8"?>
-<w:document xmlns:wpc="http://schemas.microsoft.com/office/word/2010/wordprocessingCanvas" xmlns:cx="http://schemas.microsoft.com/office/drawing/2014/chartex" xmlns:cx1="http://schemas.microsoft.com/office/drawing/2015/9/8/chartex" xmlns:cx2="http://schemas.microsoft.com/office/drawing/2015/10/21/chartex" xmlns:cx3="http://schemas.microsoft.com/office/drawing/2016/5/9/chartex" xmlns:cx4="http://schemas.microsoft.com/office/drawing/2016/5/10/chartex" xmlns:cx5="http://schemas.microsoft.com/office/drawing/2016/5/11/chartex" xmlns:cx6="http://schemas.microsoft.com/office/drawing/2016/5/12/chartex" xmlns:cx7="http://schemas.microsoft.com/office/drawing/2016/5/13/chartex" xmlns:cx8="http://schemas.microsoft.com/office/drawing/2016/5/14/chartex" xmlns:mc="http://schemas.openxmlformats.org/markup-compatibility/2006" xmlns:aink="http://schemas.microsoft.com/office/drawing/2016/ink" xmlns:am3d="http://schemas.microsoft.com/office/drawing/2017/model3d" xmlns:o="urn:schemas-microsoft-com:office:office" xmlns:r="http://schemas.openxmlformats.org/officeDocument/2006/relationships" xmlns:m="http://schemas.openxmlformats.org/officeDocument/2006/math" xmlns:v="urn:schemas-microsoft-com:vml" xmlns:wp14="http://schemas.microsoft.com/office/word/2010/wordprocessingDrawing" xmlns:wp="http://schemas.openxmlformats.org/drawingml/2006/wordprocessingDrawing" xmlns:w10="urn:schemas-microsoft-com:office:word" xmlns:w="http://schemas.openxmlformats.org/wordprocessingml/2006/main" xmlns:w14="http://schemas.microsoft.com/office/word/2010/wordml" xmlns:w15="http://schemas.microsoft.com/office/word/2012/wordml" xmlns:w16cex="http://schemas.microsoft.com/office/word/2018/wordml/cex" xmlns:w16cid="http://schemas.microsoft.com/office/word/2016/wordml/cid" xmlns:w16="http://schemas.microsoft.com/office/word/2018/wordml" xmlns:w16sdtdh="http://schemas.microsoft.com/office/word/2020/wordml/sdtdatahash" xmlns:w16se="http://schemas.microsoft.com/office/word/2015/wordml/symex" xmlns:wpg="http://schemas.microsoft.com/office/word/2010/wordprocessingGroup" xmlns:wpi="http://schemas.microsoft.com/office/word/2010/wordprocessingInk" xmlns:wne="http://schemas.microsoft.com/office/word/2006/wordml" xmlns:wps="http://schemas.microsoft.com/office/word/2010/wordprocessingShape" mc:Ignorable="w14 w15 w16se w16cid w16 w16cex w16sdtdh wp14">
+<w:document xmlns:wpc="http://schemas.microsoft.com/office/word/2010/wordprocessingCanvas" xmlns:cx="http://schemas.microsoft.com/office/drawing/2014/chartex" xmlns:cx1="http://schemas.microsoft.com/office/drawing/2015/9/8/chartex" xmlns:cx2="http://schemas.microsoft.com/office/drawing/2015/10/21/chartex" xmlns:cx3="http://schemas.microsoft.com/office/drawing/2016/5/9/chartex" xmlns:cx4="http://schemas.microsoft.com/office/drawing/2016/5/10/chartex" xmlns:cx5="http://schemas.microsoft.com/office/drawing/2016/5/11/chartex" xmlns:cx6="http://schemas.microsoft.com/office/drawing/2016/5/12/chartex" xmlns:cx7="http://schemas.microsoft.com/office/drawing/2016/5/13/chartex" xmlns:cx8="http://schemas.microsoft.com/office/drawing/2016/5/14/chartex" xmlns:mc="http://schemas.openxmlformats.org/markup-compatibility/2006" xmlns:aink="http://schemas.microsoft.com/office/drawing/2016/ink" xmlns:am3d="http://schemas.microsoft.com/office/drawing/2017/model3d" xmlns:o="urn:schemas-microsoft-com:office:office" xmlns:oel="http://schemas.microsoft.com/office/2019/extlst" xmlns:r="http://schemas.openxmlformats.org/officeDocument/2006/relationships" xmlns:m="http://schemas.openxmlformats.org/officeDocument/2006/math" xmlns:v="urn:schemas-microsoft-com:vml" xmlns:wp14="http://schemas.microsoft.com/office/word/2010/wordprocessingDrawing" xmlns:wp="http://schemas.openxmlformats.org/drawingml/2006/wordprocessingDrawing" xmlns:w10="urn:schemas-microsoft-com:office:word" xmlns:w="http://schemas.openxmlformats.org/wordprocessingml/2006/main" xmlns:w14="http://schemas.microsoft.com/office/word/2010/wordml" xmlns:w15="http://schemas.microsoft.com/office/word/2012/wordml" xmlns:w16cex="http://schemas.microsoft.com/office/word/2018/wordml/cex" xmlns:w16cid="http://schemas.microsoft.com/office/word/2016/wordml/cid" xmlns:w16="http://schemas.microsoft.com/office/word/2018/wordml" xmlns:w16du="http://schemas.microsoft.com/office/word/2023/wordml/word16du" xmlns:w16sdtdh="http://schemas.microsoft.com/office/word/2020/wordml/sdtdatahash" xmlns:w16sdtfl="http://schemas.microsoft.com/office/word/2024/wordml/sdtformatlock" xmlns:w16se="http://schemas.microsoft.com/office/word/2015/wordml/symex" xmlns:wpg="http://schemas.microsoft.com/office/word/2010/wordprocessingGroup" xmlns:wpi="http://schemas.microsoft.com/office/word/2010/wordprocessingInk" xmlns:wne="http://schemas.microsoft.com/office/word/2006/wordml" xmlns:wps="http://schemas.microsoft.com/office/word/2010/wordprocessingShape" mc:Ignorable="w14 w15 w16se w16cid w16 w16cex w16sdtdh w16sdtfl w16du wp14">
   <w:body>
     <w:p>
       <w:pPr>
@@ -28,28 +28,7 @@
           <w:szCs w:val="28"/>
           <w:lang w:eastAsia="en-US"/>
         </w:rPr>
-        <w:t xml:space="preserve">Nome do Projeto: </w:t>
-      </w:r>
-      <w:r>
-        <w:rPr>
-          <w:rFonts w:ascii="Calibri Light" w:eastAsia="MS Gothic" w:hAnsi="Calibri Light" w:cs="Times New Roman"/>
-          <w:b/>
-          <w:bCs/>
-          <w:sz w:val="28"/>
-          <w:szCs w:val="28"/>
-          <w:lang w:eastAsia="en-US"/>
-        </w:rPr>
-      </w:r>
-      <w:r>
-        <w:rPr>
-          <w:rFonts w:ascii="Calibri Light" w:eastAsia="MS Gothic" w:hAnsi="Calibri Light" w:cs="Times New Roman"/>
-          <w:b/>
-          <w:bCs/>
-          <w:sz w:val="28"/>
-          <w:szCs w:val="28"/>
-          <w:lang w:eastAsia="en-US"/>
-        </w:rPr>
-        <w:t>Lê Ai</w:t>
+        <w:t>Nome do Projeto: Lê Ai</w:t>
       </w:r>
     </w:p>
     <w:p>
@@ -75,7 +54,7 @@
     <w:tbl>
       <w:tblPr>
         <w:tblStyle w:val="a"/>
-        <w:tblW w:w="8644" w:type="dxa"/>
+        <w:tblW w:w="9039" w:type="dxa"/>
         <w:tblInd w:w="0" w:type="dxa"/>
         <w:tblBorders>
           <w:top w:val="single" w:sz="4" w:space="0" w:color="000000"/>
@@ -93,12 +72,12 @@
         <w:gridCol w:w="1559"/>
         <w:gridCol w:w="1574"/>
         <w:gridCol w:w="410"/>
-        <w:gridCol w:w="2299"/>
+        <w:gridCol w:w="2694"/>
       </w:tblGrid>
       <w:tr>
         <w:tc>
           <w:tcPr>
-            <w:tcW w:w="8644" w:type="dxa"/>
+            <w:tcW w:w="9039" w:type="dxa"/>
             <w:gridSpan w:val="5"/>
             <w:shd w:val="clear" w:color="auto" w:fill="DBE5F1" w:themeFill="accent1" w:themeFillTint="33"/>
           </w:tcPr>
@@ -121,7 +100,7 @@
       <w:tr>
         <w:tc>
           <w:tcPr>
-            <w:tcW w:w="8644" w:type="dxa"/>
+            <w:tcW w:w="9039" w:type="dxa"/>
             <w:gridSpan w:val="5"/>
           </w:tcPr>
           <w:p>
@@ -145,7 +124,7 @@
       <w:tr>
         <w:tc>
           <w:tcPr>
-            <w:tcW w:w="8644" w:type="dxa"/>
+            <w:tcW w:w="9039" w:type="dxa"/>
             <w:gridSpan w:val="5"/>
           </w:tcPr>
           <w:p>
@@ -169,7 +148,7 @@
       <w:tr>
         <w:tc>
           <w:tcPr>
-            <w:tcW w:w="8644" w:type="dxa"/>
+            <w:tcW w:w="9039" w:type="dxa"/>
             <w:gridSpan w:val="5"/>
           </w:tcPr>
           <w:p>
@@ -193,7 +172,7 @@
       <w:tr>
         <w:tc>
           <w:tcPr>
-            <w:tcW w:w="8644" w:type="dxa"/>
+            <w:tcW w:w="9039" w:type="dxa"/>
             <w:gridSpan w:val="5"/>
             <w:shd w:val="clear" w:color="auto" w:fill="DBE5F1" w:themeFill="accent1" w:themeFillTint="33"/>
           </w:tcPr>
@@ -228,12 +207,12 @@
         </w:tc>
         <w:tc>
           <w:tcPr>
-            <w:tcW w:w="2709" w:type="dxa"/>
+            <w:tcW w:w="3104" w:type="dxa"/>
             <w:gridSpan w:val="2"/>
           </w:tcPr>
           <w:p>
             <w:r>
-              <w:t>Contato</w:t>
+              <w:t>Assinatura</w:t>
             </w:r>
           </w:p>
         </w:tc>
@@ -284,24 +263,44 @@
         </w:tc>
         <w:tc>
           <w:tcPr>
-            <w:tcW w:w="2709" w:type="dxa"/>
+            <w:tcW w:w="3104" w:type="dxa"/>
             <w:gridSpan w:val="2"/>
           </w:tcPr>
           <w:p>
             <w:pPr>
               <w:spacing w:after="40"/>
-            </w:pPr>
-            <w:r>
-              <w:rPr>
-                <w:rFonts w:ascii="Calibri Light" w:eastAsia="MS Gothic" w:hAnsi="Calibri Light" w:cs="Times New Roman"/>
-                <w:b/>
-                <w:bCs/>
-                <w:sz w:val="28"/>
-                <w:szCs w:val="28"/>
-                <w:lang w:eastAsia="en-US"/>
-              </w:rPr>
-              <w:t>@vicenzofms</w:t>
-            </w:r>
+              <w:rPr>
+                <w:rFonts w:ascii="Calibri Light" w:eastAsia="MS Gothic" w:hAnsi="Calibri Light" w:cs="Times New Roman"/>
+                <w:b/>
+                <w:bCs/>
+                <w:sz w:val="28"/>
+                <w:szCs w:val="28"/>
+                <w:lang w:eastAsia="en-US"/>
+              </w:rPr>
+            </w:pPr>
+          </w:p>
+          <w:p>
+            <w:pPr>
+              <w:spacing w:after="40"/>
+              <w:rPr>
+                <w:rFonts w:ascii="Calibri Light" w:eastAsia="MS Gothic" w:hAnsi="Calibri Light" w:cs="Times New Roman"/>
+                <w:b/>
+                <w:bCs/>
+                <w:sz w:val="28"/>
+                <w:szCs w:val="28"/>
+                <w:lang w:eastAsia="en-US"/>
+              </w:rPr>
+            </w:pPr>
+          </w:p>
+          <w:p>
+            <w:pPr>
+              <w:spacing w:after="40"/>
+            </w:pPr>
+          </w:p>
+          <w:p>
+            <w:pPr>
+              <w:spacing w:after="40"/>
+            </w:pPr>
           </w:p>
         </w:tc>
       </w:tr>
@@ -351,24 +350,44 @@
         </w:tc>
         <w:tc>
           <w:tcPr>
-            <w:tcW w:w="2709" w:type="dxa"/>
+            <w:tcW w:w="3104" w:type="dxa"/>
             <w:gridSpan w:val="2"/>
           </w:tcPr>
           <w:p>
             <w:pPr>
               <w:spacing w:after="40"/>
-            </w:pPr>
-            <w:r>
-              <w:rPr>
-                <w:rFonts w:ascii="Calibri Light" w:eastAsia="MS Gothic" w:hAnsi="Calibri Light" w:cs="Times New Roman"/>
-                <w:b/>
-                <w:bCs/>
-                <w:sz w:val="28"/>
-                <w:szCs w:val="28"/>
-                <w:lang w:eastAsia="en-US"/>
-              </w:rPr>
-              <w:t>@henriquegdc</w:t>
-            </w:r>
+              <w:rPr>
+                <w:rFonts w:ascii="Calibri Light" w:eastAsia="MS Gothic" w:hAnsi="Calibri Light" w:cs="Times New Roman"/>
+                <w:b/>
+                <w:bCs/>
+                <w:sz w:val="28"/>
+                <w:szCs w:val="28"/>
+                <w:lang w:eastAsia="en-US"/>
+              </w:rPr>
+            </w:pPr>
+          </w:p>
+          <w:p>
+            <w:pPr>
+              <w:spacing w:after="40"/>
+              <w:rPr>
+                <w:rFonts w:ascii="Calibri Light" w:eastAsia="MS Gothic" w:hAnsi="Calibri Light" w:cs="Times New Roman"/>
+                <w:b/>
+                <w:bCs/>
+                <w:sz w:val="28"/>
+                <w:szCs w:val="28"/>
+                <w:lang w:eastAsia="en-US"/>
+              </w:rPr>
+            </w:pPr>
+          </w:p>
+          <w:p>
+            <w:pPr>
+              <w:spacing w:after="40"/>
+            </w:pPr>
+          </w:p>
+          <w:p>
+            <w:pPr>
+              <w:spacing w:after="40"/>
+            </w:pPr>
           </w:p>
         </w:tc>
       </w:tr>
@@ -418,24 +437,39 @@
         </w:tc>
         <w:tc>
           <w:tcPr>
-            <w:tcW w:w="2709" w:type="dxa"/>
+            <w:tcW w:w="3104" w:type="dxa"/>
             <w:gridSpan w:val="2"/>
           </w:tcPr>
           <w:p>
             <w:pPr>
               <w:spacing w:after="40"/>
-            </w:pPr>
-            <w:r>
-              <w:rPr>
-                <w:rFonts w:ascii="Calibri Light" w:eastAsia="MS Gothic" w:hAnsi="Calibri Light" w:cs="Times New Roman"/>
-                <w:b/>
-                <w:bCs/>
-                <w:sz w:val="28"/>
-                <w:szCs w:val="28"/>
-                <w:lang w:eastAsia="en-US"/>
-              </w:rPr>
-              <w:t>@RenatoDNS</w:t>
-            </w:r>
+              <w:rPr>
+                <w:rFonts w:ascii="Calibri Light" w:eastAsia="MS Gothic" w:hAnsi="Calibri Light" w:cs="Times New Roman"/>
+                <w:b/>
+                <w:bCs/>
+                <w:sz w:val="28"/>
+                <w:szCs w:val="28"/>
+                <w:lang w:eastAsia="en-US"/>
+              </w:rPr>
+            </w:pPr>
+          </w:p>
+          <w:p>
+            <w:pPr>
+              <w:spacing w:after="40"/>
+              <w:rPr>
+                <w:rFonts w:ascii="Calibri Light" w:eastAsia="MS Gothic" w:hAnsi="Calibri Light" w:cs="Times New Roman"/>
+                <w:b/>
+                <w:bCs/>
+                <w:sz w:val="28"/>
+                <w:szCs w:val="28"/>
+                <w:lang w:eastAsia="en-US"/>
+              </w:rPr>
+            </w:pPr>
+          </w:p>
+          <w:p>
+            <w:pPr>
+              <w:spacing w:after="40"/>
+            </w:pPr>
           </w:p>
         </w:tc>
       </w:tr>
@@ -485,24 +519,52 @@
         </w:tc>
         <w:tc>
           <w:tcPr>
-            <w:tcW w:w="2709" w:type="dxa"/>
+            <w:tcW w:w="3104" w:type="dxa"/>
             <w:gridSpan w:val="2"/>
           </w:tcPr>
           <w:p>
             <w:pPr>
               <w:spacing w:after="40"/>
-            </w:pPr>
-            <w:r>
-              <w:rPr>
-                <w:rFonts w:ascii="Calibri Light" w:eastAsia="MS Gothic" w:hAnsi="Calibri Light" w:cs="Times New Roman"/>
-                <w:b/>
-                <w:bCs/>
-                <w:sz w:val="28"/>
-                <w:szCs w:val="28"/>
-                <w:lang w:eastAsia="en-US"/>
-              </w:rPr>
-              <w:t>@analufreitasx</w:t>
-            </w:r>
+              <w:rPr>
+                <w:rFonts w:ascii="Calibri Light" w:eastAsia="MS Gothic" w:hAnsi="Calibri Light" w:cs="Times New Roman"/>
+                <w:b/>
+                <w:bCs/>
+                <w:sz w:val="28"/>
+                <w:szCs w:val="28"/>
+                <w:lang w:eastAsia="en-US"/>
+              </w:rPr>
+            </w:pPr>
+          </w:p>
+          <w:p>
+            <w:pPr>
+              <w:spacing w:after="40"/>
+              <w:rPr>
+                <w:rFonts w:ascii="Calibri Light" w:eastAsia="MS Gothic" w:hAnsi="Calibri Light" w:cs="Times New Roman"/>
+                <w:b/>
+                <w:bCs/>
+                <w:sz w:val="28"/>
+                <w:szCs w:val="28"/>
+                <w:lang w:eastAsia="en-US"/>
+              </w:rPr>
+            </w:pPr>
+          </w:p>
+          <w:p>
+            <w:pPr>
+              <w:spacing w:after="40"/>
+              <w:rPr>
+                <w:rFonts w:ascii="Calibri Light" w:eastAsia="MS Gothic" w:hAnsi="Calibri Light" w:cs="Times New Roman"/>
+                <w:b/>
+                <w:bCs/>
+                <w:sz w:val="28"/>
+                <w:szCs w:val="28"/>
+                <w:lang w:eastAsia="en-US"/>
+              </w:rPr>
+            </w:pPr>
+          </w:p>
+          <w:p>
+            <w:pPr>
+              <w:spacing w:after="40"/>
+            </w:pPr>
           </w:p>
         </w:tc>
       </w:tr>
@@ -558,7 +620,7 @@
         </w:tc>
         <w:tc>
           <w:tcPr>
-            <w:tcW w:w="2709" w:type="dxa"/>
+            <w:tcW w:w="3104" w:type="dxa"/>
             <w:gridSpan w:val="2"/>
             <w:tcBorders>
               <w:bottom w:val="single" w:sz="4" w:space="0" w:color="000000"/>
@@ -568,24 +630,13 @@
             <w:pPr>
               <w:spacing w:after="40"/>
             </w:pPr>
-            <w:r>
-              <w:rPr>
-                <w:rFonts w:ascii="Calibri Light" w:eastAsia="MS Gothic" w:hAnsi="Calibri Light" w:cs="Times New Roman"/>
-                <w:b/>
-                <w:bCs/>
-                <w:sz w:val="28"/>
-                <w:szCs w:val="28"/>
-                <w:lang w:eastAsia="en-US"/>
-              </w:rPr>
-              <w:t>@Eman134</w:t>
-            </w:r>
           </w:p>
         </w:tc>
       </w:tr>
       <w:tr>
         <w:tc>
           <w:tcPr>
-            <w:tcW w:w="8644" w:type="dxa"/>
+            <w:tcW w:w="9039" w:type="dxa"/>
             <w:gridSpan w:val="5"/>
             <w:shd w:val="clear" w:color="auto" w:fill="DBE5F1" w:themeFill="accent1" w:themeFillTint="33"/>
           </w:tcPr>
@@ -599,7 +650,7 @@
       <w:tr>
         <w:tc>
           <w:tcPr>
-            <w:tcW w:w="8644" w:type="dxa"/>
+            <w:tcW w:w="9039" w:type="dxa"/>
             <w:gridSpan w:val="5"/>
             <w:tcBorders>
               <w:bottom w:val="single" w:sz="4" w:space="0" w:color="000000"/>
@@ -698,7 +749,19 @@
                 <w:szCs w:val="28"/>
                 <w:lang w:eastAsia="en-US"/>
               </w:rPr>
-              <w:t>6. Escolha da ferramenta de gestão do trabalho (quadro Kanban) e do processo de trabalho.</w:t>
+              <w:t xml:space="preserve">6. Escolha da ferramenta de gestão do trabalho (quadro Kanban) e do </w:t>
+            </w:r>
+            <w:r>
+              <w:rPr>
+                <w:rFonts w:ascii="Calibri Light" w:eastAsia="MS Gothic" w:hAnsi="Calibri Light" w:cs="Times New Roman"/>
+                <w:b/>
+                <w:bCs/>
+                <w:sz w:val="28"/>
+                <w:szCs w:val="28"/>
+                <w:lang w:eastAsia="en-US"/>
+              </w:rPr>
+              <w:lastRenderedPageBreak/>
+              <w:t>processo de trabalho.</w:t>
             </w:r>
           </w:p>
           <w:p>
@@ -722,12 +785,13 @@
       <w:tr>
         <w:tc>
           <w:tcPr>
-            <w:tcW w:w="8644" w:type="dxa"/>
+            <w:tcW w:w="9039" w:type="dxa"/>
             <w:gridSpan w:val="5"/>
             <w:shd w:val="clear" w:color="auto" w:fill="DBE5F1" w:themeFill="accent1" w:themeFillTint="33"/>
           </w:tcPr>
           <w:p>
             <w:r>
+              <w:lastRenderedPageBreak/>
               <w:t>Notas e Decisões</w:t>
             </w:r>
           </w:p>
@@ -736,7 +800,7 @@
       <w:tr>
         <w:tc>
           <w:tcPr>
-            <w:tcW w:w="8644" w:type="dxa"/>
+            <w:tcW w:w="9039" w:type="dxa"/>
             <w:gridSpan w:val="5"/>
             <w:tcBorders>
               <w:bottom w:val="single" w:sz="4" w:space="0" w:color="000000"/>
@@ -762,16 +826,6 @@
             <w:pPr>
               <w:spacing w:after="40"/>
             </w:pPr>
-            <w:r>
-              <w:rPr>
-                <w:rFonts w:ascii="Calibri Light" w:eastAsia="MS Gothic" w:hAnsi="Calibri Light" w:cs="Times New Roman"/>
-                <w:b/>
-                <w:bCs/>
-                <w:sz w:val="28"/>
-                <w:szCs w:val="28"/>
-                <w:lang w:eastAsia="en-US"/>
-              </w:rPr>
-            </w:r>
           </w:p>
           <w:p>
             <w:pPr>
@@ -793,16 +847,6 @@
             <w:pPr>
               <w:spacing w:after="40"/>
             </w:pPr>
-            <w:r>
-              <w:rPr>
-                <w:rFonts w:ascii="Calibri Light" w:eastAsia="MS Gothic" w:hAnsi="Calibri Light" w:cs="Times New Roman"/>
-                <w:b/>
-                <w:bCs/>
-                <w:sz w:val="28"/>
-                <w:szCs w:val="28"/>
-                <w:lang w:eastAsia="en-US"/>
-              </w:rPr>
-            </w:r>
           </w:p>
           <w:p>
             <w:pPr>
@@ -824,16 +868,6 @@
             <w:pPr>
               <w:spacing w:after="40"/>
             </w:pPr>
-            <w:r>
-              <w:rPr>
-                <w:rFonts w:ascii="Calibri Light" w:eastAsia="MS Gothic" w:hAnsi="Calibri Light" w:cs="Times New Roman"/>
-                <w:b/>
-                <w:bCs/>
-                <w:sz w:val="28"/>
-                <w:szCs w:val="28"/>
-                <w:lang w:eastAsia="en-US"/>
-              </w:rPr>
-            </w:r>
           </w:p>
           <w:p>
             <w:pPr>
@@ -855,16 +889,6 @@
             <w:pPr>
               <w:spacing w:after="40"/>
             </w:pPr>
-            <w:r>
-              <w:rPr>
-                <w:rFonts w:ascii="Calibri Light" w:eastAsia="MS Gothic" w:hAnsi="Calibri Light" w:cs="Times New Roman"/>
-                <w:b/>
-                <w:bCs/>
-                <w:sz w:val="28"/>
-                <w:szCs w:val="28"/>
-                <w:lang w:eastAsia="en-US"/>
-              </w:rPr>
-            </w:r>
           </w:p>
           <w:p>
             <w:pPr>
@@ -886,16 +910,6 @@
             <w:pPr>
               <w:spacing w:after="40"/>
             </w:pPr>
-            <w:r>
-              <w:rPr>
-                <w:rFonts w:ascii="Calibri Light" w:eastAsia="MS Gothic" w:hAnsi="Calibri Light" w:cs="Times New Roman"/>
-                <w:b/>
-                <w:bCs/>
-                <w:sz w:val="28"/>
-                <w:szCs w:val="28"/>
-                <w:lang w:eastAsia="en-US"/>
-              </w:rPr>
-            </w:r>
           </w:p>
           <w:p>
             <w:pPr>
@@ -917,47 +931,39 @@
             <w:pPr>
               <w:spacing w:after="40"/>
             </w:pPr>
-            <w:r>
-              <w:rPr>
-                <w:rFonts w:ascii="Calibri Light" w:eastAsia="MS Gothic" w:hAnsi="Calibri Light" w:cs="Times New Roman"/>
-                <w:b/>
-                <w:bCs/>
-                <w:sz w:val="28"/>
-                <w:szCs w:val="28"/>
-                <w:lang w:eastAsia="en-US"/>
-              </w:rPr>
-            </w:r>
-          </w:p>
-          <w:p>
-            <w:pPr>
-              <w:spacing w:after="40"/>
-            </w:pPr>
-            <w:r>
-              <w:rPr>
-                <w:rFonts w:ascii="Calibri Light" w:eastAsia="MS Gothic" w:hAnsi="Calibri Light" w:cs="Times New Roman"/>
-                <w:b/>
-                <w:bCs/>
-                <w:sz w:val="28"/>
-                <w:szCs w:val="28"/>
-                <w:lang w:eastAsia="en-US"/>
-              </w:rPr>
-              <w:t>6. Requisitos de qualidade acordados — telas principais respondendo em até 2 segundos no percentil 80 em rede móvel; senhas armazenadas apenas como hash, autenticação por token e tratamento de dados pessoais conforme a LGPD; testes automatizados escritos junto com a funcionalidade; integração contínua verde como condição obrigatória para incorporar código à branch principal.</w:t>
-            </w:r>
-          </w:p>
-          <w:p>
-            <w:pPr>
-              <w:spacing w:after="40"/>
-            </w:pPr>
-            <w:r>
-              <w:rPr>
-                <w:rFonts w:ascii="Calibri Light" w:eastAsia="MS Gothic" w:hAnsi="Calibri Light" w:cs="Times New Roman"/>
-                <w:b/>
-                <w:bCs/>
-                <w:sz w:val="28"/>
-                <w:szCs w:val="28"/>
-                <w:lang w:eastAsia="en-US"/>
-              </w:rPr>
-            </w:r>
+          </w:p>
+          <w:p>
+            <w:pPr>
+              <w:spacing w:after="40"/>
+            </w:pPr>
+            <w:r>
+              <w:rPr>
+                <w:rFonts w:ascii="Calibri Light" w:eastAsia="MS Gothic" w:hAnsi="Calibri Light" w:cs="Times New Roman"/>
+                <w:b/>
+                <w:bCs/>
+                <w:sz w:val="28"/>
+                <w:szCs w:val="28"/>
+                <w:lang w:eastAsia="en-US"/>
+              </w:rPr>
+              <w:t xml:space="preserve">6. Requisitos de qualidade acordados — telas principais respondendo em até </w:t>
+            </w:r>
+            <w:r>
+              <w:rPr>
+                <w:rFonts w:ascii="Calibri Light" w:eastAsia="MS Gothic" w:hAnsi="Calibri Light" w:cs="Times New Roman"/>
+                <w:b/>
+                <w:bCs/>
+                <w:sz w:val="28"/>
+                <w:szCs w:val="28"/>
+                <w:lang w:eastAsia="en-US"/>
+              </w:rPr>
+              <w:lastRenderedPageBreak/>
+              <w:t>2 segundos no percentil 80 em rede móvel; senhas armazenadas apenas como hash, autenticação por token e tratamento de dados pessoais conforme a LGPD; testes automatizados escritos junto com a funcionalidade; integração contínua verde como condição obrigatória para incorporar código à branch principal.</w:t>
+            </w:r>
+          </w:p>
+          <w:p>
+            <w:pPr>
+              <w:spacing w:after="40"/>
+            </w:pPr>
           </w:p>
           <w:p>
             <w:pPr>
@@ -979,16 +985,6 @@
             <w:pPr>
               <w:spacing w:after="40"/>
             </w:pPr>
-            <w:r>
-              <w:rPr>
-                <w:rFonts w:ascii="Calibri Light" w:eastAsia="MS Gothic" w:hAnsi="Calibri Light" w:cs="Times New Roman"/>
-                <w:b/>
-                <w:bCs/>
-                <w:sz w:val="28"/>
-                <w:szCs w:val="28"/>
-                <w:lang w:eastAsia="en-US"/>
-              </w:rPr>
-            </w:r>
           </w:p>
           <w:p>
             <w:pPr>
@@ -1010,16 +1006,6 @@
             <w:pPr>
               <w:spacing w:after="40"/>
             </w:pPr>
-            <w:r>
-              <w:rPr>
-                <w:rFonts w:ascii="Calibri Light" w:eastAsia="MS Gothic" w:hAnsi="Calibri Light" w:cs="Times New Roman"/>
-                <w:b/>
-                <w:bCs/>
-                <w:sz w:val="28"/>
-                <w:szCs w:val="28"/>
-                <w:lang w:eastAsia="en-US"/>
-              </w:rPr>
-            </w:r>
           </w:p>
           <w:p>
             <w:pPr>
@@ -1041,16 +1027,6 @@
             <w:pPr>
               <w:spacing w:after="40"/>
             </w:pPr>
-            <w:r>
-              <w:rPr>
-                <w:rFonts w:ascii="Calibri Light" w:eastAsia="MS Gothic" w:hAnsi="Calibri Light" w:cs="Times New Roman"/>
-                <w:b/>
-                <w:bCs/>
-                <w:sz w:val="28"/>
-                <w:szCs w:val="28"/>
-                <w:lang w:eastAsia="en-US"/>
-              </w:rPr>
-            </w:r>
           </w:p>
           <w:p>
             <w:pPr>
@@ -1168,16 +1144,6 @@
             <w:pPr>
               <w:spacing w:after="40"/>
             </w:pPr>
-            <w:r>
-              <w:rPr>
-                <w:rFonts w:ascii="Calibri Light" w:eastAsia="MS Gothic" w:hAnsi="Calibri Light" w:cs="Times New Roman"/>
-                <w:b/>
-                <w:bCs/>
-                <w:sz w:val="28"/>
-                <w:szCs w:val="28"/>
-                <w:lang w:eastAsia="en-US"/>
-              </w:rPr>
-            </w:r>
           </w:p>
           <w:p>
             <w:pPr>
@@ -1200,12 +1166,13 @@
       <w:tr>
         <w:tc>
           <w:tcPr>
-            <w:tcW w:w="8644" w:type="dxa"/>
+            <w:tcW w:w="9039" w:type="dxa"/>
             <w:gridSpan w:val="5"/>
             <w:shd w:val="clear" w:color="auto" w:fill="DBE5F1" w:themeFill="accent1" w:themeFillTint="33"/>
           </w:tcPr>
           <w:p>
             <w:r>
+              <w:lastRenderedPageBreak/>
               <w:t>Pendências</w:t>
             </w:r>
           </w:p>
@@ -1236,7 +1203,7 @@
         </w:tc>
         <w:tc>
           <w:tcPr>
-            <w:tcW w:w="2299" w:type="dxa"/>
+            <w:tcW w:w="2694" w:type="dxa"/>
           </w:tcPr>
           <w:p>
             <w:r>
@@ -1292,7 +1259,7 @@
         </w:tc>
         <w:tc>
           <w:tcPr>
-            <w:tcW w:w="2299" w:type="dxa"/>
+            <w:tcW w:w="2694" w:type="dxa"/>
           </w:tcPr>
           <w:p>
             <w:pPr>
@@ -1359,7 +1326,7 @@
         </w:tc>
         <w:tc>
           <w:tcPr>
-            <w:tcW w:w="2299" w:type="dxa"/>
+            <w:tcW w:w="2694" w:type="dxa"/>
           </w:tcPr>
           <w:p>
             <w:pPr>
@@ -1426,7 +1393,7 @@
         </w:tc>
         <w:tc>
           <w:tcPr>
-            <w:tcW w:w="2299" w:type="dxa"/>
+            <w:tcW w:w="2694" w:type="dxa"/>
           </w:tcPr>
           <w:p>
             <w:pPr>
@@ -1493,7 +1460,7 @@
         </w:tc>
         <w:tc>
           <w:tcPr>
-            <w:tcW w:w="2299" w:type="dxa"/>
+            <w:tcW w:w="2694" w:type="dxa"/>
           </w:tcPr>
           <w:p>
             <w:pPr>
@@ -1560,7 +1527,7 @@
         </w:tc>
         <w:tc>
           <w:tcPr>
-            <w:tcW w:w="2299" w:type="dxa"/>
+            <w:tcW w:w="2694" w:type="dxa"/>
           </w:tcPr>
           <w:p>
             <w:pPr>
@@ -1627,7 +1594,7 @@
         </w:tc>
         <w:tc>
           <w:tcPr>
-            <w:tcW w:w="2299" w:type="dxa"/>
+            <w:tcW w:w="2694" w:type="dxa"/>
           </w:tcPr>
           <w:p>
             <w:pPr>
@@ -1685,6 +1652,7 @@
           <w:szCs w:val="28"/>
           <w:lang w:eastAsia="en-US"/>
         </w:rPr>
+        <w:lastRenderedPageBreak/>
         <w:t>https://github.com/orgs/ICEI-PUC-Minas-PMGES-TI/projects/738</w:t>
       </w:r>
     </w:p>
@@ -1726,7 +1694,7 @@
 </file>
 
 <file path=word/endnotes.xml><?xml version="1.0" encoding="utf-8"?>
-<w:endnotes xmlns:wpc="http://schemas.microsoft.com/office/word/2010/wordprocessingCanvas" xmlns:cx="http://schemas.microsoft.com/office/drawing/2014/chartex" xmlns:cx1="http://schemas.microsoft.com/office/drawing/2015/9/8/chartex" xmlns:cx2="http://schemas.microsoft.com/office/drawing/2015/10/21/chartex" xmlns:cx3="http://schemas.microsoft.com/office/drawing/2016/5/9/chartex" xmlns:cx4="http://schemas.microsoft.com/office/drawing/2016/5/10/chartex" xmlns:cx5="http://schemas.microsoft.com/office/drawing/2016/5/11/chartex" xmlns:cx6="http://schemas.microsoft.com/office/drawing/2016/5/12/chartex" xmlns:cx7="http://schemas.microsoft.com/office/drawing/2016/5/13/chartex" xmlns:cx8="http://schemas.microsoft.com/office/drawing/2016/5/14/chartex" xmlns:mc="http://schemas.openxmlformats.org/markup-compatibility/2006" xmlns:aink="http://schemas.microsoft.com/office/drawing/2016/ink" xmlns:am3d="http://schemas.microsoft.com/office/drawing/2017/model3d" xmlns:o="urn:schemas-microsoft-com:office:office" xmlns:r="http://schemas.openxmlformats.org/officeDocument/2006/relationships" xmlns:m="http://schemas.openxmlformats.org/officeDocument/2006/math" xmlns:v="urn:schemas-microsoft-com:vml" xmlns:wp14="http://schemas.microsoft.com/office/word/2010/wordprocessingDrawing" xmlns:wp="http://schemas.openxmlformats.org/drawingml/2006/wordprocessingDrawing" xmlns:w10="urn:schemas-microsoft-com:office:word" xmlns:w="http://schemas.openxmlformats.org/wordprocessingml/2006/main" xmlns:w14="http://schemas.microsoft.com/office/word/2010/wordml" xmlns:w15="http://schemas.microsoft.com/office/word/2012/wordml" xmlns:w16cex="http://schemas.microsoft.com/office/word/2018/wordml/cex" xmlns:w16cid="http://schemas.microsoft.com/office/word/2016/wordml/cid" xmlns:w16="http://schemas.microsoft.com/office/word/2018/wordml" xmlns:w16sdtdh="http://schemas.microsoft.com/office/word/2020/wordml/sdtdatahash" xmlns:w16se="http://schemas.microsoft.com/office/word/2015/wordml/symex" xmlns:wpg="http://schemas.microsoft.com/office/word/2010/wordprocessingGroup" xmlns:wpi="http://schemas.microsoft.com/office/word/2010/wordprocessingInk" xmlns:wne="http://schemas.microsoft.com/office/word/2006/wordml" xmlns:wps="http://schemas.microsoft.com/office/word/2010/wordprocessingShape" mc:Ignorable="w14 w15 w16se w16cid w16 w16cex w16sdtdh wp14">
+<w:endnotes xmlns:wpc="http://schemas.microsoft.com/office/word/2010/wordprocessingCanvas" xmlns:cx="http://schemas.microsoft.com/office/drawing/2014/chartex" xmlns:cx1="http://schemas.microsoft.com/office/drawing/2015/9/8/chartex" xmlns:cx2="http://schemas.microsoft.com/office/drawing/2015/10/21/chartex" xmlns:cx3="http://schemas.microsoft.com/office/drawing/2016/5/9/chartex" xmlns:cx4="http://schemas.microsoft.com/office/drawing/2016/5/10/chartex" xmlns:cx5="http://schemas.microsoft.com/office/drawing/2016/5/11/chartex" xmlns:cx6="http://schemas.microsoft.com/office/drawing/2016/5/12/chartex" xmlns:cx7="http://schemas.microsoft.com/office/drawing/2016/5/13/chartex" xmlns:cx8="http://schemas.microsoft.com/office/drawing/2016/5/14/chartex" xmlns:mc="http://schemas.openxmlformats.org/markup-compatibility/2006" xmlns:aink="http://schemas.microsoft.com/office/drawing/2016/ink" xmlns:am3d="http://schemas.microsoft.com/office/drawing/2017/model3d" xmlns:o="urn:schemas-microsoft-com:office:office" xmlns:oel="http://schemas.microsoft.com/office/2019/extlst" xmlns:r="http://schemas.openxmlformats.org/officeDocument/2006/relationships" xmlns:m="http://schemas.openxmlformats.org/officeDocument/2006/math" xmlns:v="urn:schemas-microsoft-com:vml" xmlns:wp14="http://schemas.microsoft.com/office/word/2010/wordprocessingDrawing" xmlns:wp="http://schemas.openxmlformats.org/drawingml/2006/wordprocessingDrawing" xmlns:w10="urn:schemas-microsoft-com:office:word" xmlns:w="http://schemas.openxmlformats.org/wordprocessingml/2006/main" xmlns:w14="http://schemas.microsoft.com/office/word/2010/wordml" xmlns:w15="http://schemas.microsoft.com/office/word/2012/wordml" xmlns:w16cex="http://schemas.microsoft.com/office/word/2018/wordml/cex" xmlns:w16cid="http://schemas.microsoft.com/office/word/2016/wordml/cid" xmlns:w16="http://schemas.microsoft.com/office/word/2018/wordml" xmlns:w16du="http://schemas.microsoft.com/office/word/2023/wordml/word16du" xmlns:w16sdtdh="http://schemas.microsoft.com/office/word/2020/wordml/sdtdatahash" xmlns:w16sdtfl="http://schemas.microsoft.com/office/word/2024/wordml/sdtformatlock" xmlns:w16se="http://schemas.microsoft.com/office/word/2015/wordml/symex" xmlns:wpg="http://schemas.microsoft.com/office/word/2010/wordprocessingGroup" xmlns:wpi="http://schemas.microsoft.com/office/word/2010/wordprocessingInk" xmlns:wne="http://schemas.microsoft.com/office/word/2006/wordml" xmlns:wps="http://schemas.microsoft.com/office/word/2010/wordprocessingShape" mc:Ignorable="w14 w15 w16se w16cid w16 w16cex w16sdtdh w16sdtfl w16du wp14">
   <w:endnote w:type="separator" w:id="-1">
     <w:p>
       <w:pPr>
@@ -1751,7 +1719,7 @@
 </file>
 
 <file path=word/footnotes.xml><?xml version="1.0" encoding="utf-8"?>
-<w:footnotes xmlns:wpc="http://schemas.microsoft.com/office/word/2010/wordprocessingCanvas" xmlns:cx="http://schemas.microsoft.com/office/drawing/2014/chartex" xmlns:cx1="http://schemas.microsoft.com/office/drawing/2015/9/8/chartex" xmlns:cx2="http://schemas.microsoft.com/office/drawing/2015/10/21/chartex" xmlns:cx3="http://schemas.microsoft.com/office/drawing/2016/5/9/chartex" xmlns:cx4="http://schemas.microsoft.com/office/drawing/2016/5/10/chartex" xmlns:cx5="http://schemas.microsoft.com/office/drawing/2016/5/11/chartex" xmlns:cx6="http://schemas.microsoft.com/office/drawing/2016/5/12/chartex" xmlns:cx7="http://schemas.microsoft.com/office/drawing/2016/5/13/chartex" xmlns:cx8="http://schemas.microsoft.com/office/drawing/2016/5/14/chartex" xmlns:mc="http://schemas.openxmlformats.org/markup-compatibility/2006" xmlns:aink="http://schemas.microsoft.com/office/drawing/2016/ink" xmlns:am3d="http://schemas.microsoft.com/office/drawing/2017/model3d" xmlns:o="urn:schemas-microsoft-com:office:office" xmlns:r="http://schemas.openxmlformats.org/officeDocument/2006/relationships" xmlns:m="http://schemas.openxmlformats.org/officeDocument/2006/math" xmlns:v="urn:schemas-microsoft-com:vml" xmlns:wp14="http://schemas.microsoft.com/office/word/2010/wordprocessingDrawing" xmlns:wp="http://schemas.openxmlformats.org/drawingml/2006/wordprocessingDrawing" xmlns:w10="urn:schemas-microsoft-com:office:word" xmlns:w="http://schemas.openxmlformats.org/wordprocessingml/2006/main" xmlns:w14="http://schemas.microsoft.com/office/word/2010/wordml" xmlns:w15="http://schemas.microsoft.com/office/word/2012/wordml" xmlns:w16cex="http://schemas.microsoft.com/office/word/2018/wordml/cex" xmlns:w16cid="http://schemas.microsoft.com/office/word/2016/wordml/cid" xmlns:w16="http://schemas.microsoft.com/office/word/2018/wordml" xmlns:w16sdtdh="http://schemas.microsoft.com/office/word/2020/wordml/sdtdatahash" xmlns:w16se="http://schemas.microsoft.com/office/word/2015/wordml/symex" xmlns:wpg="http://schemas.microsoft.com/office/word/2010/wordprocessingGroup" xmlns:wpi="http://schemas.microsoft.com/office/word/2010/wordprocessingInk" xmlns:wne="http://schemas.microsoft.com/office/word/2006/wordml" xmlns:wps="http://schemas.microsoft.com/office/word/2010/wordprocessingShape" mc:Ignorable="w14 w15 w16se w16cid w16 w16cex w16sdtdh wp14">
+<w:footnotes xmlns:wpc="http://schemas.microsoft.com/office/word/2010/wordprocessingCanvas" xmlns:cx="http://schemas.microsoft.com/office/drawing/2014/chartex" xmlns:cx1="http://schemas.microsoft.com/office/drawing/2015/9/8/chartex" xmlns:cx2="http://schemas.microsoft.com/office/drawing/2015/10/21/chartex" xmlns:cx3="http://schemas.microsoft.com/office/drawing/2016/5/9/chartex" xmlns:cx4="http://schemas.microsoft.com/office/drawing/2016/5/10/chartex" xmlns:cx5="http://schemas.microsoft.com/office/drawing/2016/5/11/chartex" xmlns:cx6="http://schemas.microsoft.com/office/drawing/2016/5/12/chartex" xmlns:cx7="http://schemas.microsoft.com/office/drawing/2016/5/13/chartex" xmlns:cx8="http://schemas.microsoft.com/office/drawing/2016/5/14/chartex" xmlns:mc="http://schemas.openxmlformats.org/markup-compatibility/2006" xmlns:aink="http://schemas.microsoft.com/office/drawing/2016/ink" xmlns:am3d="http://schemas.microsoft.com/office/drawing/2017/model3d" xmlns:o="urn:schemas-microsoft-com:office:office" xmlns:oel="http://schemas.microsoft.com/office/2019/extlst" xmlns:r="http://schemas.openxmlformats.org/officeDocument/2006/relationships" xmlns:m="http://schemas.openxmlformats.org/officeDocument/2006/math" xmlns:v="urn:schemas-microsoft-com:vml" xmlns:wp14="http://schemas.microsoft.com/office/word/2010/wordprocessingDrawing" xmlns:wp="http://schemas.openxmlformats.org/drawingml/2006/wordprocessingDrawing" xmlns:w10="urn:schemas-microsoft-com:office:word" xmlns:w="http://schemas.openxmlformats.org/wordprocessingml/2006/main" xmlns:w14="http://schemas.microsoft.com/office/word/2010/wordml" xmlns:w15="http://schemas.microsoft.com/office/word/2012/wordml" xmlns:w16cex="http://schemas.microsoft.com/office/word/2018/wordml/cex" xmlns:w16cid="http://schemas.microsoft.com/office/word/2016/wordml/cid" xmlns:w16="http://schemas.microsoft.com/office/word/2018/wordml" xmlns:w16du="http://schemas.microsoft.com/office/word/2023/wordml/word16du" xmlns:w16sdtdh="http://schemas.microsoft.com/office/word/2020/wordml/sdtdatahash" xmlns:w16sdtfl="http://schemas.microsoft.com/office/word/2024/wordml/sdtformatlock" xmlns:w16se="http://schemas.microsoft.com/office/word/2015/wordml/symex" xmlns:wpg="http://schemas.microsoft.com/office/word/2010/wordprocessingGroup" xmlns:wpi="http://schemas.microsoft.com/office/word/2010/wordprocessingInk" xmlns:wne="http://schemas.microsoft.com/office/word/2006/wordml" xmlns:wps="http://schemas.microsoft.com/office/word/2010/wordprocessingShape" mc:Ignorable="w14 w15 w16se w16cid w16 w16cex w16sdtdh w16sdtfl w16du wp14">
   <w:footnote w:type="separator" w:id="-1">
     <w:p>
       <w:pPr>
@@ -1776,7 +1744,7 @@
 </file>
 
 <file path=word/header1.xml><?xml version="1.0" encoding="utf-8"?>
-<w:hdr xmlns:wpc="http://schemas.microsoft.com/office/word/2010/wordprocessingCanvas" xmlns:cx="http://schemas.microsoft.com/office/drawing/2014/chartex" xmlns:cx1="http://schemas.microsoft.com/office/drawing/2015/9/8/chartex" xmlns:cx2="http://schemas.microsoft.com/office/drawing/2015/10/21/chartex" xmlns:cx3="http://schemas.microsoft.com/office/drawing/2016/5/9/chartex" xmlns:cx4="http://schemas.microsoft.com/office/drawing/2016/5/10/chartex" xmlns:cx5="http://schemas.microsoft.com/office/drawing/2016/5/11/chartex" xmlns:cx6="http://schemas.microsoft.com/office/drawing/2016/5/12/chartex" xmlns:cx7="http://schemas.microsoft.com/office/drawing/2016/5/13/chartex" xmlns:cx8="http://schemas.microsoft.com/office/drawing/2016/5/14/chartex" xmlns:mc="http://schemas.openxmlformats.org/markup-compatibility/2006" xmlns:aink="http://schemas.microsoft.com/office/drawing/2016/ink" xmlns:am3d="http://schemas.microsoft.com/office/drawing/2017/model3d" xmlns:o="urn:schemas-microsoft-com:office:office" xmlns:r="http://schemas.openxmlformats.org/officeDocument/2006/relationships" xmlns:m="http://schemas.openxmlformats.org/officeDocument/2006/math" xmlns:v="urn:schemas-microsoft-com:vml" xmlns:wp14="http://schemas.microsoft.com/office/word/2010/wordprocessingDrawing" xmlns:wp="http://schemas.openxmlformats.org/drawingml/2006/wordprocessingDrawing" xmlns:w10="urn:schemas-microsoft-com:office:word" xmlns:w="http://schemas.openxmlformats.org/wordprocessingml/2006/main" xmlns:w14="http://schemas.microsoft.com/office/word/2010/wordml" xmlns:w15="http://schemas.microsoft.com/office/word/2012/wordml" xmlns:w16cex="http://schemas.microsoft.com/office/word/2018/wordml/cex" xmlns:w16cid="http://schemas.microsoft.com/office/word/2016/wordml/cid" xmlns:w16="http://schemas.microsoft.com/office/word/2018/wordml" xmlns:w16sdtdh="http://schemas.microsoft.com/office/word/2020/wordml/sdtdatahash" xmlns:w16se="http://schemas.microsoft.com/office/word/2015/wordml/symex" xmlns:wpg="http://schemas.microsoft.com/office/word/2010/wordprocessingGroup" xmlns:wpi="http://schemas.microsoft.com/office/word/2010/wordprocessingInk" xmlns:wne="http://schemas.microsoft.com/office/word/2006/wordml" xmlns:wps="http://schemas.microsoft.com/office/word/2010/wordprocessingShape" mc:Ignorable="w14 w15 w16se w16cid w16 w16cex w16sdtdh wp14">
+<w:hdr xmlns:wpc="http://schemas.microsoft.com/office/word/2010/wordprocessingCanvas" xmlns:cx="http://schemas.microsoft.com/office/drawing/2014/chartex" xmlns:cx1="http://schemas.microsoft.com/office/drawing/2015/9/8/chartex" xmlns:cx2="http://schemas.microsoft.com/office/drawing/2015/10/21/chartex" xmlns:cx3="http://schemas.microsoft.com/office/drawing/2016/5/9/chartex" xmlns:cx4="http://schemas.microsoft.com/office/drawing/2016/5/10/chartex" xmlns:cx5="http://schemas.microsoft.com/office/drawing/2016/5/11/chartex" xmlns:cx6="http://schemas.microsoft.com/office/drawing/2016/5/12/chartex" xmlns:cx7="http://schemas.microsoft.com/office/drawing/2016/5/13/chartex" xmlns:cx8="http://schemas.microsoft.com/office/drawing/2016/5/14/chartex" xmlns:mc="http://schemas.openxmlformats.org/markup-compatibility/2006" xmlns:aink="http://schemas.microsoft.com/office/drawing/2016/ink" xmlns:am3d="http://schemas.microsoft.com/office/drawing/2017/model3d" xmlns:o="urn:schemas-microsoft-com:office:office" xmlns:oel="http://schemas.microsoft.com/office/2019/extlst" xmlns:r="http://schemas.openxmlformats.org/officeDocument/2006/relationships" xmlns:m="http://schemas.openxmlformats.org/officeDocument/2006/math" xmlns:v="urn:schemas-microsoft-com:vml" xmlns:wp14="http://schemas.microsoft.com/office/word/2010/wordprocessingDrawing" xmlns:wp="http://schemas.openxmlformats.org/drawingml/2006/wordprocessingDrawing" xmlns:w10="urn:schemas-microsoft-com:office:word" xmlns:w="http://schemas.openxmlformats.org/wordprocessingml/2006/main" xmlns:w14="http://schemas.microsoft.com/office/word/2010/wordml" xmlns:w15="http://schemas.microsoft.com/office/word/2012/wordml" xmlns:w16cex="http://schemas.microsoft.com/office/word/2018/wordml/cex" xmlns:w16cid="http://schemas.microsoft.com/office/word/2016/wordml/cid" xmlns:w16="http://schemas.microsoft.com/office/word/2018/wordml" xmlns:w16du="http://schemas.microsoft.com/office/word/2023/wordml/word16du" xmlns:w16sdtdh="http://schemas.microsoft.com/office/word/2020/wordml/sdtdatahash" xmlns:w16sdtfl="http://schemas.microsoft.com/office/word/2024/wordml/sdtformatlock" xmlns:w16se="http://schemas.microsoft.com/office/word/2015/wordml/symex" xmlns:wpg="http://schemas.microsoft.com/office/word/2010/wordprocessingGroup" xmlns:wpi="http://schemas.microsoft.com/office/word/2010/wordprocessingInk" xmlns:wne="http://schemas.microsoft.com/office/word/2006/wordml" xmlns:wps="http://schemas.microsoft.com/office/word/2010/wordprocessingShape" mc:Ignorable="w14 w15 w16se w16cid w16 w16cex w16sdtdh w16sdtfl w16du wp14">
   <w:p>
     <w:pPr>
       <w:pStyle w:val="Cabealho"/>
@@ -1800,7 +1768,7 @@
 </file>
 
 <file path=word/styles.xml><?xml version="1.0" encoding="utf-8"?>
-<w:styles xmlns:mc="http://schemas.openxmlformats.org/markup-compatibility/2006" xmlns:r="http://schemas.openxmlformats.org/officeDocument/2006/relationships" xmlns:w="http://schemas.openxmlformats.org/wordprocessingml/2006/main" xmlns:w14="http://schemas.microsoft.com/office/word/2010/wordml" xmlns:w15="http://schemas.microsoft.com/office/word/2012/wordml" xmlns:w16cex="http://schemas.microsoft.com/office/word/2018/wordml/cex" xmlns:w16cid="http://schemas.microsoft.com/office/word/2016/wordml/cid" xmlns:w16="http://schemas.microsoft.com/office/word/2018/wordml" xmlns:w16sdtdh="http://schemas.microsoft.com/office/word/2020/wordml/sdtdatahash" xmlns:w16se="http://schemas.microsoft.com/office/word/2015/wordml/symex" mc:Ignorable="w14 w15 w16se w16cid w16 w16cex w16sdtdh">
+<w:styles xmlns:mc="http://schemas.openxmlformats.org/markup-compatibility/2006" xmlns:r="http://schemas.openxmlformats.org/officeDocument/2006/relationships" xmlns:w="http://schemas.openxmlformats.org/wordprocessingml/2006/main" xmlns:w14="http://schemas.microsoft.com/office/word/2010/wordml" xmlns:w15="http://schemas.microsoft.com/office/word/2012/wordml" xmlns:w16cex="http://schemas.microsoft.com/office/word/2018/wordml/cex" xmlns:w16cid="http://schemas.microsoft.com/office/word/2016/wordml/cid" xmlns:w16="http://schemas.microsoft.com/office/word/2018/wordml" xmlns:w16du="http://schemas.microsoft.com/office/word/2023/wordml/word16du" xmlns:w16sdtdh="http://schemas.microsoft.com/office/word/2020/wordml/sdtdatahash" xmlns:w16sdtfl="http://schemas.microsoft.com/office/word/2024/wordml/sdtformatlock" xmlns:w16se="http://schemas.microsoft.com/office/word/2015/wordml/symex" mc:Ignorable="w14 w15 w16se w16cid w16 w16cex w16sdtdh w16sdtfl w16du">
   <w:docDefaults>
     <w:rPrDefault>
       <w:rPr>
@@ -1971,7 +1939,7 @@
     <w:lsdException w:name="Table Web 2" w:semiHidden="1" w:unhideWhenUsed="1"/>
     <w:lsdException w:name="Table Web 3" w:semiHidden="1" w:unhideWhenUsed="1"/>
     <w:lsdException w:name="Balloon Text" w:semiHidden="1" w:unhideWhenUsed="1"/>
-    <w:lsdException w:name="Table Grid" w:semiHidden="1" w:uiPriority="39" w:unhideWhenUsed="1"/>
+    <w:lsdException w:name="Table Grid" w:uiPriority="39"/>
     <w:lsdException w:name="Table Theme" w:semiHidden="1" w:unhideWhenUsed="1"/>
     <w:lsdException w:name="Placeholder Text" w:semiHidden="1"/>
     <w:lsdException w:name="No Spacing" w:uiPriority="1" w:qFormat="1"/>

</xml_diff>